<commit_message>
Hoja de compromiso: punto de trabajo en clase (simulaciones, ticket de salida, celular guardado); 6 puntos
</commit_message>
<xml_diff>
--- a/documentos_operativos/plantillas/HOJA_COMPROMISO_ESTUDIANTE.docx
+++ b/documentos_operativos/plantillas/HOJA_COMPROMISO_ESTUDIANTE.docx
@@ -29,7 +29,7 @@
           <w:color w:val="777777"/>
           <w:sz w:val="18"/>
         </w:rPr>
-        <w:t>Garantía de aprendizaje, portafolio de videos y puntualidad · Heiiu English Academy — Global Teacher S.A.S., NIT 900.422.478-2</w:t>
+        <w:t>Garantía de aprendizaje: asistencia, puntualidad, trabajo en clase y tareas · Heiiu English Academy — Global Teacher S.A.S., NIT 900.422.478-2</w:t>
       </w:r>
     </w:p>
     <w:p>
@@ -93,7 +93,26 @@
           <w:b/>
           <w:sz w:val="21"/>
         </w:rPr>
-        <w:t xml:space="preserve">3. Recibo feedback, no notas, de mi profesor. </w:t>
+        <w:t xml:space="preserve">3. Trabajo en clase. </w:t>
+      </w:r>
+      <w:r>
+        <w:rPr>
+          <w:sz w:val="21"/>
+        </w:rPr>
+        <w:t>La clase es hablada y en inglés: participo en las simulaciones y en los ejercicios, entrego mi ticket de salida al final de cada clase y mantengo el celular guardado durante la clase. Lo que se practica en clase es lo que la garantía mide después.</w:t>
+      </w:r>
+    </w:p>
+    <w:p>
+      <w:pPr>
+        <w:spacing w:after="120"/>
+        <w:ind w:left="170"/>
+      </w:pPr>
+      <w:r>
+        <w:rPr>
+          <w:b/>
+          <w:sz w:val="21"/>
+        </w:rPr>
+        <w:t xml:space="preserve">4. Recibo feedback, no notas, de mi profesor. </w:t>
       </w:r>
       <w:r>
         <w:rPr>
@@ -112,7 +131,7 @@
           <w:b/>
           <w:sz w:val="21"/>
         </w:rPr>
-        <w:t xml:space="preserve">4. Puntualidad. </w:t>
+        <w:t xml:space="preserve">5. Puntualidad. </w:t>
       </w:r>
       <w:r>
         <w:rPr>
@@ -131,7 +150,7 @@
           <w:b/>
           <w:sz w:val="21"/>
         </w:rPr>
-        <w:t xml:space="preserve">5. Esta hoja no cambia mi contrato. </w:t>
+        <w:t xml:space="preserve">6. Esta hoja no cambia mi contrato. </w:t>
       </w:r>
       <w:r>
         <w:rPr>

</xml_diff>